<commit_message>
Final Fix v3 HVIA Task | Add MongoDB Connection to Data-Pipline-Example/sales_pipeline.ipynb
</commit_message>
<xml_diff>
--- a/HVIA/3-Olist Review - Notebook Aligned.docx
+++ b/HVIA/3-Olist Review - Notebook Aligned.docx
@@ -22,6 +22,10 @@
     <w:p>
       <w:pPr>
         <w:jc w:val="center"/>
+        <w:rPr>
+          <w:b/>
+          <w:sz w:val="24"/>
+        </w:rPr>
       </w:pPr>
       <w:r>
         <w:rPr>
@@ -29,6 +33,14 @@
           <w:sz w:val="24"/>
         </w:rPr>
         <w:t>Notebook-aligned business analysis and HVIA solution proposal</w:t>
+      </w:r>
+    </w:p>
+    <w:p>
+      <w:pPr>
+        <w:jc w:val="center"/>
+      </w:pPr>
+      <w:r>
+        <w:t>https://prezi.com/craft/?click_source=logged_element&amp;page_location=bottom_cta&amp;element_text=try_prezi_for_free&amp;load=jyauL1SJpytX4xuNdXneHn</w:t>
       </w:r>
     </w:p>
     <w:p>
@@ -41,7 +53,21 @@
     </w:p>
     <w:p>
       <w:r>
-        <w:t>This review has been updated to reflect the analysis actually implemented in 2-olist.ipynb. The notebook covers data-quality checks, delivery-stage analysis, customer-state delivery performance, payment/order reconciliation, state-level revenue and freight, review scores versus delivery timing, seller-level delivery performance, and a SQL Server export setup.</w:t>
+        <w:t xml:space="preserve">This review </w:t>
+      </w:r>
+      <w:r>
+        <w:t>reflects</w:t>
+      </w:r>
+      <w:r>
+        <w:t xml:space="preserve"> the analysis actually implemented in 2-</w:t>
+      </w:r>
+      <w:proofErr w:type="gramStart"/>
+      <w:r>
+        <w:t>olist.ipynb</w:t>
+      </w:r>
+      <w:proofErr w:type="gramEnd"/>
+      <w:r>
+        <w:t>. The notebook covers data-quality checks, delivery-stage analysis, customer-state delivery performance, payment/order reconciliation, state-level revenue and freight, review scores versus delivery timing, seller-level delivery performance, and a SQL Server export setup.</w:t>
       </w:r>
     </w:p>
     <w:p>
@@ -74,19 +100,26 @@
     </w:p>
     <w:p>
       <w:r>
-        <w:t>Review delivery-status categories are created from the same error measure: early (&lt;0 days), on_time (=0), late (&gt;0 and &lt;=4 days), very_late (&gt;4 days), and unknown when the delivery error is missing.</w:t>
+        <w:t>Review delivery-status categories are created from the same error measure: early (&lt;0 days), on</w:t>
+      </w:r>
+      <w:r>
+        <w:t xml:space="preserve"> </w:t>
+      </w:r>
+      <w:r>
+        <w:t>time (=0), late (&gt;0 and &lt;=4 days), very</w:t>
+      </w:r>
+      <w:r>
+        <w:t xml:space="preserve"> </w:t>
+      </w:r>
+      <w:r>
+        <w:t>late (&gt;4 days), and unknown when the delivery error is missing.</w:t>
       </w:r>
     </w:p>
-    <w:p/>
-    <w:p/>
-    <w:p/>
-    <w:p/>
     <w:p>
       <w:pPr>
         <w:pStyle w:val="Heading1"/>
       </w:pPr>
       <w:r>
-        <w:lastRenderedPageBreak/>
         <w:t>Analysis and Findings</w:t>
       </w:r>
     </w:p>
@@ -105,9 +138,14 @@
     </w:p>
     <w:p>
       <w:r>
-        <w:t>In the notebook output, every state has a negative average delivery-estimation error, meaning average actual delivery was earlier than the estimated date in every state shown. The magnitude differs substantially by state. For example, AL has an average error of -8.03 days, while AC has -20.08 days. Carrier-to-customer duration also varies substantially, from 5.60 days in SP to 25.64 days in RR.</w:t>
+        <w:t xml:space="preserve">In the notebook output, every state has a negative average delivery-estimation error, meaning average actual delivery was earlier than the estimated date in every state shown. The magnitude differs substantially by state. </w:t>
+      </w:r>
+      <w:r>
+        <w:lastRenderedPageBreak/>
+        <w:t>For example, AL has an average error of -8.03 days, while AC has -20.08 days. Carrier-to-customer duration also varies substantially, from 5.60 days in SP to 25.64 days in RR.</w:t>
       </w:r>
     </w:p>
+    <w:p/>
     <w:tbl>
       <w:tblPr>
         <w:tblStyle w:val="TableGrid"/>
@@ -171,8 +209,17 @@
                 <w:b/>
                 <w:sz w:val="18"/>
               </w:rPr>
-              <w:t>Avg. approval→carrier</w:t>
+              <w:t xml:space="preserve">Avg. </w:t>
             </w:r>
+            <w:proofErr w:type="spellStart"/>
+            <w:r>
+              <w:rPr>
+                <w:b/>
+                <w:sz w:val="18"/>
+              </w:rPr>
+              <w:t>approval→carrier</w:t>
+            </w:r>
+            <w:proofErr w:type="spellEnd"/>
           </w:p>
         </w:tc>
         <w:tc>
@@ -187,8 +234,17 @@
                 <w:b/>
                 <w:sz w:val="18"/>
               </w:rPr>
-              <w:t>Avg. carrier→customer</w:t>
+              <w:t xml:space="preserve">Avg. </w:t>
             </w:r>
+            <w:proofErr w:type="spellStart"/>
+            <w:r>
+              <w:rPr>
+                <w:b/>
+                <w:sz w:val="18"/>
+              </w:rPr>
+              <w:t>carrier→customer</w:t>
+            </w:r>
+            <w:proofErr w:type="spellEnd"/>
           </w:p>
         </w:tc>
         <w:tc>
@@ -583,11 +639,6 @@
     </w:tbl>
     <w:p/>
     <w:p>
-      <w:r>
-        <w:t>Business interpretation: the state-level view is useful for identifying regional differences, but the notebook does not establish why those differences occur. Distance, carrier coverage, fulfillment practices, and handoff performance are possible areas for further investigation rather than conclusions from this analysis.</w:t>
-      </w:r>
-    </w:p>
-    <w:p>
       <w:pPr>
         <w:pStyle w:val="Heading2"/>
       </w:pPr>
@@ -602,7 +653,52 @@
     </w:p>
     <w:p>
       <w:r>
-        <w:t>The state-level output shows that carrier-to-customer time is often the largest component of total delivery duration. This makes the carrier-to-customer stage a useful diagnostic dimension, while the notebook does not by itself prove that the carrier is responsible for all variation.</w:t>
+        <w:rPr>
+          <w:noProof/>
+        </w:rPr>
+        <w:drawing>
+          <wp:inline distT="0" distB="0" distL="0" distR="0" wp14:anchorId="18016FCA" wp14:editId="233B8DF2">
+            <wp:extent cx="6309360" cy="3523615"/>
+            <wp:effectExtent l="0" t="0" r="0" b="635"/>
+            <wp:docPr id="1553203734" name="Picture 1"/>
+            <wp:cNvGraphicFramePr>
+              <a:graphicFrameLocks xmlns:a="http://schemas.openxmlformats.org/drawingml/2006/main" noChangeAspect="1"/>
+            </wp:cNvGraphicFramePr>
+            <a:graphic xmlns:a="http://schemas.openxmlformats.org/drawingml/2006/main">
+              <a:graphicData uri="http://schemas.openxmlformats.org/drawingml/2006/picture">
+                <pic:pic xmlns:pic="http://schemas.openxmlformats.org/drawingml/2006/picture">
+                  <pic:nvPicPr>
+                    <pic:cNvPr id="1553203734" name=""/>
+                    <pic:cNvPicPr/>
+                  </pic:nvPicPr>
+                  <pic:blipFill>
+                    <a:blip r:embed="rId8"/>
+                    <a:stretch>
+                      <a:fillRect/>
+                    </a:stretch>
+                  </pic:blipFill>
+                  <pic:spPr>
+                    <a:xfrm>
+                      <a:off x="0" y="0"/>
+                      <a:ext cx="6309360" cy="3523615"/>
+                    </a:xfrm>
+                    <a:prstGeom prst="rect">
+                      <a:avLst/>
+                    </a:prstGeom>
+                  </pic:spPr>
+                </pic:pic>
+              </a:graphicData>
+            </a:graphic>
+          </wp:inline>
+        </w:drawing>
+      </w:r>
+    </w:p>
+    <w:p>
+      <w:r>
+        <w:t>The state-level output shows that carrier-to-customer time is often the largest component of total delivery duration. This makes the carrier-to-customer stage a useful diagnostic dimension</w:t>
+      </w:r>
+      <w:r>
+        <w:t>.</w:t>
       </w:r>
     </w:p>
     <w:p>
@@ -615,7 +711,55 @@
     </w:p>
     <w:p>
       <w:r>
-        <w:t>The notebook aggregates item prices and freight by order, aggregates payment values by order, defines order_total as items_total + freight_total, and calculates payment_minus_order as payment_total - order_total.</w:t>
+        <w:t xml:space="preserve">The notebook aggregates item prices and freight by order, aggregates payment values by order, defines </w:t>
+      </w:r>
+      <w:proofErr w:type="spellStart"/>
+      <w:r>
+        <w:t>order_total</w:t>
+      </w:r>
+      <w:proofErr w:type="spellEnd"/>
+      <w:r>
+        <w:t xml:space="preserve"> as </w:t>
+      </w:r>
+      <w:proofErr w:type="spellStart"/>
+      <w:r>
+        <w:t>items_total</w:t>
+      </w:r>
+      <w:proofErr w:type="spellEnd"/>
+      <w:r>
+        <w:t xml:space="preserve"> + </w:t>
+      </w:r>
+      <w:proofErr w:type="spellStart"/>
+      <w:r>
+        <w:t>freight_total</w:t>
+      </w:r>
+      <w:proofErr w:type="spellEnd"/>
+      <w:r>
+        <w:t xml:space="preserve">, and calculates </w:t>
+      </w:r>
+      <w:proofErr w:type="spellStart"/>
+      <w:r>
+        <w:t>payment_minus_order</w:t>
+      </w:r>
+      <w:proofErr w:type="spellEnd"/>
+      <w:r>
+        <w:t xml:space="preserve"> as </w:t>
+      </w:r>
+      <w:proofErr w:type="spellStart"/>
+      <w:r>
+        <w:t>payment_total</w:t>
+      </w:r>
+      <w:proofErr w:type="spellEnd"/>
+      <w:r>
+        <w:t xml:space="preserve"> - </w:t>
+      </w:r>
+      <w:proofErr w:type="spellStart"/>
+      <w:r>
+        <w:t>order_total</w:t>
+      </w:r>
+      <w:proofErr w:type="spellEnd"/>
+      <w:r>
+        <w:t>.</w:t>
       </w:r>
     </w:p>
     <w:tbl>
@@ -779,6 +923,7 @@
               <w:rPr>
                 <w:sz w:val="18"/>
               </w:rPr>
+              <w:lastRenderedPageBreak/>
               <w:t>Net payment difference</w:t>
             </w:r>
           </w:p>
@@ -802,7 +947,49 @@
     <w:p/>
     <w:p>
       <w:r>
-        <w:t>These values are screening signals, not proof of financial loss or accounting failure. The notebook does not classify the causes of the differences. Payment structure, multiple payments, rounding, refunds, freight treatment, order status, or data-quality rules should be investigated before treating the net difference as a financial-impact measure.</w:t>
+        <w:rPr>
+          <w:noProof/>
+        </w:rPr>
+        <w:drawing>
+          <wp:inline distT="0" distB="0" distL="0" distR="0" wp14:anchorId="644FB9E6" wp14:editId="62E3AF21">
+            <wp:extent cx="6309360" cy="2317750"/>
+            <wp:effectExtent l="0" t="0" r="0" b="6350"/>
+            <wp:docPr id="695459782" name="Picture 1"/>
+            <wp:cNvGraphicFramePr>
+              <a:graphicFrameLocks xmlns:a="http://schemas.openxmlformats.org/drawingml/2006/main" noChangeAspect="1"/>
+            </wp:cNvGraphicFramePr>
+            <a:graphic xmlns:a="http://schemas.openxmlformats.org/drawingml/2006/main">
+              <a:graphicData uri="http://schemas.openxmlformats.org/drawingml/2006/picture">
+                <pic:pic xmlns:pic="http://schemas.openxmlformats.org/drawingml/2006/picture">
+                  <pic:nvPicPr>
+                    <pic:cNvPr id="695459782" name=""/>
+                    <pic:cNvPicPr/>
+                  </pic:nvPicPr>
+                  <pic:blipFill>
+                    <a:blip r:embed="rId9"/>
+                    <a:stretch>
+                      <a:fillRect/>
+                    </a:stretch>
+                  </pic:blipFill>
+                  <pic:spPr>
+                    <a:xfrm>
+                      <a:off x="0" y="0"/>
+                      <a:ext cx="6309360" cy="2317750"/>
+                    </a:xfrm>
+                    <a:prstGeom prst="rect">
+                      <a:avLst/>
+                    </a:prstGeom>
+                  </pic:spPr>
+                </pic:pic>
+              </a:graphicData>
+            </a:graphic>
+          </wp:inline>
+        </w:drawing>
+      </w:r>
+    </w:p>
+    <w:p>
+      <w:r>
+        <w:t>These values are screening signals, not proof of financial loss or accounting failure. Payment structure, multiple payments, rounding, refunds, freight treatment, order status, or data-quality rules should be investigated before treating the net difference as a financial-impact measure.</w:t>
       </w:r>
     </w:p>
     <w:p>
@@ -810,7 +997,6 @@
         <w:pStyle w:val="Heading2"/>
       </w:pPr>
       <w:r>
-        <w:lastRenderedPageBreak/>
         <w:t>4. Revenue and freight differ across customer states</w:t>
       </w:r>
     </w:p>
@@ -1294,10 +1480,143 @@
         </w:tc>
       </w:tr>
     </w:tbl>
-    <w:p/>
     <w:p>
       <w:r>
-        <w:t>Business interpretation: the output can support regional revenue and freight monitoring. Freight levels and variability should be interpreted alongside order volume and geographic mix; the notebook does not model freight drivers or profitability.</w:t>
+        <w:rPr>
+          <w:noProof/>
+        </w:rPr>
+        <w:drawing>
+          <wp:anchor distT="0" distB="0" distL="114300" distR="114300" simplePos="0" relativeHeight="251667456" behindDoc="1" locked="0" layoutInCell="1" allowOverlap="1" wp14:anchorId="235995EB" wp14:editId="5E957071">
+            <wp:simplePos x="0" y="0"/>
+            <wp:positionH relativeFrom="column">
+              <wp:posOffset>3192780</wp:posOffset>
+            </wp:positionH>
+            <wp:positionV relativeFrom="paragraph">
+              <wp:posOffset>245110</wp:posOffset>
+            </wp:positionV>
+            <wp:extent cx="3310255" cy="3229610"/>
+            <wp:effectExtent l="0" t="0" r="4445" b="8890"/>
+            <wp:wrapThrough wrapText="bothSides">
+              <wp:wrapPolygon edited="0">
+                <wp:start x="0" y="0"/>
+                <wp:lineTo x="0" y="21532"/>
+                <wp:lineTo x="21505" y="21532"/>
+                <wp:lineTo x="21505" y="0"/>
+                <wp:lineTo x="0" y="0"/>
+              </wp:wrapPolygon>
+            </wp:wrapThrough>
+            <wp:docPr id="226352210" name="Picture 1"/>
+            <wp:cNvGraphicFramePr>
+              <a:graphicFrameLocks xmlns:a="http://schemas.openxmlformats.org/drawingml/2006/main" noChangeAspect="1"/>
+            </wp:cNvGraphicFramePr>
+            <a:graphic xmlns:a="http://schemas.openxmlformats.org/drawingml/2006/main">
+              <a:graphicData uri="http://schemas.openxmlformats.org/drawingml/2006/picture">
+                <pic:pic xmlns:pic="http://schemas.openxmlformats.org/drawingml/2006/picture">
+                  <pic:nvPicPr>
+                    <pic:cNvPr id="0" name="Picture 1"/>
+                    <pic:cNvPicPr>
+                      <a:picLocks noChangeAspect="1" noChangeArrowheads="1"/>
+                    </pic:cNvPicPr>
+                  </pic:nvPicPr>
+                  <pic:blipFill>
+                    <a:blip r:embed="rId10">
+                      <a:extLst>
+                        <a:ext uri="{28A0092B-C50C-407E-A947-70E740481C1C}">
+                          <a14:useLocalDpi xmlns:a14="http://schemas.microsoft.com/office/drawing/2010/main" val="0"/>
+                        </a:ext>
+                      </a:extLst>
+                    </a:blip>
+                    <a:srcRect/>
+                    <a:stretch>
+                      <a:fillRect/>
+                    </a:stretch>
+                  </pic:blipFill>
+                  <pic:spPr bwMode="auto">
+                    <a:xfrm>
+                      <a:off x="0" y="0"/>
+                      <a:ext cx="3310255" cy="3229610"/>
+                    </a:xfrm>
+                    <a:prstGeom prst="rect">
+                      <a:avLst/>
+                    </a:prstGeom>
+                    <a:noFill/>
+                    <a:ln>
+                      <a:noFill/>
+                    </a:ln>
+                  </pic:spPr>
+                </pic:pic>
+              </a:graphicData>
+            </a:graphic>
+            <wp14:sizeRelH relativeFrom="margin">
+              <wp14:pctWidth>0</wp14:pctWidth>
+            </wp14:sizeRelH>
+            <wp14:sizeRelV relativeFrom="margin">
+              <wp14:pctHeight>0</wp14:pctHeight>
+            </wp14:sizeRelV>
+          </wp:anchor>
+        </w:drawing>
+      </w:r>
+      <w:r>
+        <w:rPr>
+          <w:noProof/>
+        </w:rPr>
+        <w:drawing>
+          <wp:anchor distT="0" distB="0" distL="114300" distR="114300" simplePos="0" relativeHeight="251655168" behindDoc="0" locked="0" layoutInCell="1" allowOverlap="1" wp14:anchorId="7BAFB380" wp14:editId="15435E03">
+            <wp:simplePos x="0" y="0"/>
+            <wp:positionH relativeFrom="column">
+              <wp:posOffset>-126365</wp:posOffset>
+            </wp:positionH>
+            <wp:positionV relativeFrom="paragraph">
+              <wp:posOffset>245110</wp:posOffset>
+            </wp:positionV>
+            <wp:extent cx="3319145" cy="3194050"/>
+            <wp:effectExtent l="0" t="0" r="0" b="6350"/>
+            <wp:wrapThrough wrapText="bothSides">
+              <wp:wrapPolygon edited="0">
+                <wp:start x="0" y="0"/>
+                <wp:lineTo x="0" y="21514"/>
+                <wp:lineTo x="21447" y="21514"/>
+                <wp:lineTo x="21447" y="0"/>
+                <wp:lineTo x="0" y="0"/>
+              </wp:wrapPolygon>
+            </wp:wrapThrough>
+            <wp:docPr id="1775377954" name="Picture 1"/>
+            <wp:cNvGraphicFramePr>
+              <a:graphicFrameLocks xmlns:a="http://schemas.openxmlformats.org/drawingml/2006/main" noChangeAspect="1"/>
+            </wp:cNvGraphicFramePr>
+            <a:graphic xmlns:a="http://schemas.openxmlformats.org/drawingml/2006/main">
+              <a:graphicData uri="http://schemas.openxmlformats.org/drawingml/2006/picture">
+                <pic:pic xmlns:pic="http://schemas.openxmlformats.org/drawingml/2006/picture">
+                  <pic:nvPicPr>
+                    <pic:cNvPr id="1775377954" name=""/>
+                    <pic:cNvPicPr/>
+                  </pic:nvPicPr>
+                  <pic:blipFill>
+                    <a:blip r:embed="rId11"/>
+                    <a:stretch>
+                      <a:fillRect/>
+                    </a:stretch>
+                  </pic:blipFill>
+                  <pic:spPr>
+                    <a:xfrm>
+                      <a:off x="0" y="0"/>
+                      <a:ext cx="3319145" cy="3194050"/>
+                    </a:xfrm>
+                    <a:prstGeom prst="rect">
+                      <a:avLst/>
+                    </a:prstGeom>
+                  </pic:spPr>
+                </pic:pic>
+              </a:graphicData>
+            </a:graphic>
+            <wp14:sizeRelH relativeFrom="margin">
+              <wp14:pctWidth>0</wp14:pctWidth>
+            </wp14:sizeRelH>
+            <wp14:sizeRelV relativeFrom="margin">
+              <wp14:pctHeight>0</wp14:pctHeight>
+            </wp14:sizeRelV>
+          </wp:anchor>
+        </w:drawing>
       </w:r>
     </w:p>
     <w:p>
@@ -1305,6 +1624,7 @@
         <w:pStyle w:val="Heading2"/>
       </w:pPr>
       <w:r>
+        <w:lastRenderedPageBreak/>
         <w:t>5. Review scores differ by delivery-status category</w:t>
       </w:r>
     </w:p>
@@ -1482,12 +1802,14 @@
             <w:vAlign w:val="center"/>
           </w:tcPr>
           <w:p>
+            <w:proofErr w:type="spellStart"/>
             <w:r>
               <w:rPr>
                 <w:sz w:val="18"/>
               </w:rPr>
               <w:t>very_late</w:t>
             </w:r>
+            <w:proofErr w:type="spellEnd"/>
           </w:p>
         </w:tc>
         <w:tc>
@@ -1570,12 +1892,63 @@
     <w:p/>
     <w:p>
       <w:r>
-        <w:t>The notebook output shown for this analysis contains no on_time row. The unknown category represents orders for which delivery-estimation error is missing, which is consistent with the notebook's earlier handling of non-delivered orders.</w:t>
+        <w:rPr>
+          <w:noProof/>
+        </w:rPr>
+        <w:drawing>
+          <wp:inline distT="0" distB="0" distL="0" distR="0" wp14:anchorId="0B130480" wp14:editId="389047E0">
+            <wp:extent cx="6309360" cy="3525520"/>
+            <wp:effectExtent l="0" t="0" r="0" b="0"/>
+            <wp:docPr id="1260540730" name="Picture 1"/>
+            <wp:cNvGraphicFramePr>
+              <a:graphicFrameLocks xmlns:a="http://schemas.openxmlformats.org/drawingml/2006/main" noChangeAspect="1"/>
+            </wp:cNvGraphicFramePr>
+            <a:graphic xmlns:a="http://schemas.openxmlformats.org/drawingml/2006/main">
+              <a:graphicData uri="http://schemas.openxmlformats.org/drawingml/2006/picture">
+                <pic:pic xmlns:pic="http://schemas.openxmlformats.org/drawingml/2006/picture">
+                  <pic:nvPicPr>
+                    <pic:cNvPr id="1260540730" name=""/>
+                    <pic:cNvPicPr/>
+                  </pic:nvPicPr>
+                  <pic:blipFill>
+                    <a:blip r:embed="rId12"/>
+                    <a:stretch>
+                      <a:fillRect/>
+                    </a:stretch>
+                  </pic:blipFill>
+                  <pic:spPr>
+                    <a:xfrm>
+                      <a:off x="0" y="0"/>
+                      <a:ext cx="6309360" cy="3525520"/>
+                    </a:xfrm>
+                    <a:prstGeom prst="rect">
+                      <a:avLst/>
+                    </a:prstGeom>
+                  </pic:spPr>
+                </pic:pic>
+              </a:graphicData>
+            </a:graphic>
+          </wp:inline>
+        </w:drawing>
       </w:r>
     </w:p>
     <w:p>
       <w:r>
-        <w:t>Business interpretation: review scores are associated with delivery-status categories in this dataset, but the analysis does not establish that delivery timing alone caused the review score. Other order and customer factors are not controlled for.</w:t>
+        <w:t>The notebook output shown for this analysis contains no on</w:t>
+      </w:r>
+      <w:r>
+        <w:t xml:space="preserve"> </w:t>
+      </w:r>
+      <w:r>
+        <w:t>time row. The unknown category represents orders for which delivery-estimation error is missing, which is consistent with the notebook's earlier handling of non-delivered orders.</w:t>
+      </w:r>
+    </w:p>
+    <w:p>
+      <w:r>
+        <w:t>Business interpretation: review scores are associated with delivery-status categories in this dataset</w:t>
+      </w:r>
+      <w:r>
+        <w:t>.</w:t>
       </w:r>
     </w:p>
     <w:p>
@@ -1666,11 +2039,19 @@
             <w:vAlign w:val="center"/>
           </w:tcPr>
           <w:p>
+            <w:proofErr w:type="spellStart"/>
             <w:r>
               <w:rPr>
                 <w:sz w:val="18"/>
               </w:rPr>
-              <w:t>farroupilha / RS</w:t>
+              <w:t>farroupilha</w:t>
+            </w:r>
+            <w:proofErr w:type="spellEnd"/>
+            <w:r>
+              <w:rPr>
+                <w:sz w:val="18"/>
+              </w:rPr>
+              <w:t xml:space="preserve"> / RS</w:t>
             </w:r>
           </w:p>
         </w:tc>
@@ -1713,11 +2094,33 @@
             <w:vAlign w:val="center"/>
           </w:tcPr>
           <w:p>
+            <w:proofErr w:type="spellStart"/>
             <w:r>
               <w:rPr>
                 <w:sz w:val="18"/>
               </w:rPr>
-              <w:t>sao paulo / SP</w:t>
+              <w:t>sao</w:t>
+            </w:r>
+            <w:proofErr w:type="spellEnd"/>
+            <w:r>
+              <w:rPr>
+                <w:sz w:val="18"/>
+              </w:rPr>
+              <w:t xml:space="preserve"> </w:t>
+            </w:r>
+            <w:proofErr w:type="spellStart"/>
+            <w:r>
+              <w:rPr>
+                <w:sz w:val="18"/>
+              </w:rPr>
+              <w:t>paulo</w:t>
+            </w:r>
+            <w:proofErr w:type="spellEnd"/>
+            <w:r>
+              <w:rPr>
+                <w:sz w:val="18"/>
+              </w:rPr>
+              <w:t xml:space="preserve"> / SP</w:t>
             </w:r>
           </w:p>
         </w:tc>
@@ -1760,11 +2163,19 @@
             <w:vAlign w:val="center"/>
           </w:tcPr>
           <w:p>
+            <w:proofErr w:type="spellStart"/>
             <w:r>
               <w:rPr>
                 <w:sz w:val="18"/>
               </w:rPr>
-              <w:t>juiz de fora / MG</w:t>
+              <w:t>juiz</w:t>
+            </w:r>
+            <w:proofErr w:type="spellEnd"/>
+            <w:r>
+              <w:rPr>
+                <w:sz w:val="18"/>
+              </w:rPr>
+              <w:t xml:space="preserve"> de fora / MG</w:t>
             </w:r>
           </w:p>
         </w:tc>
@@ -1807,11 +2218,33 @@
             <w:vAlign w:val="center"/>
           </w:tcPr>
           <w:p>
+            <w:proofErr w:type="spellStart"/>
             <w:r>
               <w:rPr>
                 <w:sz w:val="18"/>
               </w:rPr>
-              <w:t>feira de santana / BA</w:t>
+              <w:t>feira</w:t>
+            </w:r>
+            <w:proofErr w:type="spellEnd"/>
+            <w:r>
+              <w:rPr>
+                <w:sz w:val="18"/>
+              </w:rPr>
+              <w:t xml:space="preserve"> de </w:t>
+            </w:r>
+            <w:proofErr w:type="spellStart"/>
+            <w:r>
+              <w:rPr>
+                <w:sz w:val="18"/>
+              </w:rPr>
+              <w:t>santana</w:t>
+            </w:r>
+            <w:proofErr w:type="spellEnd"/>
+            <w:r>
+              <w:rPr>
+                <w:sz w:val="18"/>
+              </w:rPr>
+              <w:t xml:space="preserve"> / BA</w:t>
             </w:r>
           </w:p>
         </w:tc>
@@ -1854,11 +2287,19 @@
             <w:vAlign w:val="center"/>
           </w:tcPr>
           <w:p>
+            <w:proofErr w:type="spellStart"/>
             <w:r>
               <w:rPr>
                 <w:sz w:val="18"/>
               </w:rPr>
-              <w:t>goiania / GO</w:t>
+              <w:t>goiania</w:t>
+            </w:r>
+            <w:proofErr w:type="spellEnd"/>
+            <w:r>
+              <w:rPr>
+                <w:sz w:val="18"/>
+              </w:rPr>
+              <w:t xml:space="preserve"> / GO</w:t>
             </w:r>
           </w:p>
         </w:tc>
@@ -1895,7 +2336,45 @@
     <w:p/>
     <w:p>
       <w:r>
-        <w:t>These extreme values are based on very small delivered-order counts in the displayed rows. Therefore, the seller output is best treated as an investigation list rather than a definitive seller ranking. A production dashboard should apply a minimum delivered-order threshold and report confidence or sample-size context.</w:t>
+        <w:rPr>
+          <w:noProof/>
+        </w:rPr>
+        <w:lastRenderedPageBreak/>
+        <w:drawing>
+          <wp:inline distT="0" distB="0" distL="0" distR="0" wp14:anchorId="3DF6FF56" wp14:editId="58EB9D06">
+            <wp:extent cx="6309360" cy="4858385"/>
+            <wp:effectExtent l="0" t="0" r="0" b="0"/>
+            <wp:docPr id="468942369" name="Picture 1"/>
+            <wp:cNvGraphicFramePr>
+              <a:graphicFrameLocks xmlns:a="http://schemas.openxmlformats.org/drawingml/2006/main" noChangeAspect="1"/>
+            </wp:cNvGraphicFramePr>
+            <a:graphic xmlns:a="http://schemas.openxmlformats.org/drawingml/2006/main">
+              <a:graphicData uri="http://schemas.openxmlformats.org/drawingml/2006/picture">
+                <pic:pic xmlns:pic="http://schemas.openxmlformats.org/drawingml/2006/picture">
+                  <pic:nvPicPr>
+                    <pic:cNvPr id="468942369" name=""/>
+                    <pic:cNvPicPr/>
+                  </pic:nvPicPr>
+                  <pic:blipFill>
+                    <a:blip r:embed="rId13"/>
+                    <a:stretch>
+                      <a:fillRect/>
+                    </a:stretch>
+                  </pic:blipFill>
+                  <pic:spPr>
+                    <a:xfrm>
+                      <a:off x="0" y="0"/>
+                      <a:ext cx="6309360" cy="4858385"/>
+                    </a:xfrm>
+                    <a:prstGeom prst="rect">
+                      <a:avLst/>
+                    </a:prstGeom>
+                  </pic:spPr>
+                </pic:pic>
+              </a:graphicData>
+            </a:graphic>
+          </wp:inline>
+        </w:drawing>
       </w:r>
     </w:p>
     <w:p>
@@ -1903,7 +2382,6 @@
         <w:pStyle w:val="Heading1"/>
       </w:pPr>
       <w:r>
-        <w:lastRenderedPageBreak/>
         <w:t>Business Interpretation</w:t>
       </w:r>
     </w:p>
@@ -1963,6 +2441,7 @@
         <w:pStyle w:val="ListBullet"/>
       </w:pPr>
       <w:r>
+        <w:lastRenderedPageBreak/>
         <w:t xml:space="preserve">Phase </w:t>
       </w:r>
       <w:r>
@@ -2030,25 +2509,6 @@
         <w:pStyle w:val="Heading1"/>
       </w:pPr>
       <w:r>
-        <w:lastRenderedPageBreak/>
-        <w:t>Supporting Work and Limitations</w:t>
-      </w:r>
-    </w:p>
-    <w:p>
-      <w:r>
-        <w:t>Supporting work: 2-olist.ipynb. The notebook preserves non-delivered orders during data-quality review because missing delivery dates align with natural order status. Delivery-stage averages and seller delivery-error analysis use delivered orders.</w:t>
-      </w:r>
-    </w:p>
-    <w:p>
-      <w:r>
-        <w:t>Important limitations: the notebook does not establish causal effects, seller responsibility, customer lifetime value, churn, or a predictive model. Seller-level extremes can be driven by very small order counts. Payment differences are reconciliation signals rather than confirmed financial losses. Review-status comparisons are associations and include an unknown category.</w:t>
-      </w:r>
-    </w:p>
-    <w:p>
-      <w:pPr>
-        <w:pStyle w:val="Heading1"/>
-      </w:pPr>
-      <w:r>
         <w:t>Supporting Work and Next Steps</w:t>
       </w:r>
     </w:p>
@@ -2064,7 +2524,15 @@
         <w:t xml:space="preserve"> </w:t>
       </w:r>
       <w:r>
-        <w:t>The analysis is based on 2-olist.ipynb, which contains the data-loading, data-quality checks, transformations, exploratory analysis. The notebook analyzes delivery performance by customer state, delivery-stage durations, payment/order reconciliation, revenue and freight by state, review scores by delivery-status category, and seller-level delivery performance.</w:t>
+        <w:t>The analysis is based on 2-</w:t>
+      </w:r>
+      <w:proofErr w:type="gramStart"/>
+      <w:r>
+        <w:t>olist.ipynb</w:t>
+      </w:r>
+      <w:proofErr w:type="gramEnd"/>
+      <w:r>
+        <w:t>, which contains the data-loading, data-quality checks, transformations, exploratory analysis. The notebook analyzes delivery performance by customer state, delivery-stage durations, payment/order reconciliation, revenue and freight by state, review scores by delivery-status category, and seller-level delivery performance.</w:t>
       </w:r>
     </w:p>
     <w:p>
@@ -2084,7 +2552,7 @@
     </w:p>
     <w:p/>
     <w:sectPr>
-      <w:footerReference w:type="default" r:id="rId8"/>
+      <w:footerReference w:type="default" r:id="rId14"/>
       <w:pgSz w:w="12240" w:h="15840"/>
       <w:pgMar w:top="1008" w:right="1152" w:bottom="1008" w:left="1152" w:header="720" w:footer="720" w:gutter="0"/>
       <w:cols w:space="720"/>
@@ -2130,8 +2598,16 @@
       <w:rPr>
         <w:sz w:val="16"/>
       </w:rPr>
-      <w:t>Olist Business Review — aligned with 2-olist.ipynb</w:t>
+      <w:t>Olist Business Review — aligned with 2-</w:t>
     </w:r>
+    <w:proofErr w:type="gramStart"/>
+    <w:r>
+      <w:rPr>
+        <w:sz w:val="16"/>
+      </w:rPr>
+      <w:t>olist.ipynb</w:t>
+    </w:r>
+    <w:proofErr w:type="gramEnd"/>
   </w:p>
 </w:ftr>
 </file>
@@ -2971,6 +3447,7 @@
   <w:style w:type="character" w:default="1" w:styleId="DefaultParagraphFont">
     <w:name w:val="Default Paragraph Font"/>
     <w:uiPriority w:val="1"/>
+    <w:semiHidden/>
     <w:unhideWhenUsed/>
   </w:style>
   <w:style w:type="table" w:default="1" w:styleId="TableNormal">
@@ -13746,6 +14223,29 @@
         <w:shd w:val="clear" w:color="auto" w:fill="FBCAA2" w:themeFill="accent6" w:themeFillTint="7F"/>
       </w:tcPr>
     </w:tblStylePr>
+  </w:style>
+  <w:style w:type="character" w:styleId="Hyperlink">
+    <w:name w:val="Hyperlink"/>
+    <w:basedOn w:val="DefaultParagraphFont"/>
+    <w:uiPriority w:val="99"/>
+    <w:unhideWhenUsed/>
+    <w:rsid w:val="002C68FD"/>
+    <w:rPr>
+      <w:color w:val="0000FF" w:themeColor="hyperlink"/>
+      <w:u w:val="single"/>
+    </w:rPr>
+  </w:style>
+  <w:style w:type="character" w:styleId="UnresolvedMention">
+    <w:name w:val="Unresolved Mention"/>
+    <w:basedOn w:val="DefaultParagraphFont"/>
+    <w:uiPriority w:val="99"/>
+    <w:semiHidden/>
+    <w:unhideWhenUsed/>
+    <w:rsid w:val="002C68FD"/>
+    <w:rPr>
+      <w:color w:val="605E5C"/>
+      <w:shd w:val="clear" w:color="auto" w:fill="E1DFDD"/>
+    </w:rPr>
   </w:style>
 </w:styles>
 </file>

</xml_diff>

<commit_message>
HVIA post review fix | Solve No_SQL_Assignment_2.js
</commit_message>
<xml_diff>
--- a/HVIA/3-Olist Review - Notebook Aligned.docx
+++ b/HVIA/3-Olist Review - Notebook Aligned.docx
@@ -2480,7 +2480,10 @@
     </w:p>
     <w:p>
       <w:r>
-        <w:t>Hi [Name],</w:t>
+        <w:t>Dear Mr. Dalvi</w:t>
+      </w:r>
+      <w:r>
+        <w:t>,</w:t>
       </w:r>
     </w:p>
     <w:p>
@@ -2494,6 +2497,13 @@
       </w:r>
     </w:p>
     <w:p>
+      <w:pPr>
+        <w:rPr>
+          <w:rFonts w:hint="cs"/>
+          <w:rtl/>
+          <w:lang w:bidi="ar-EG"/>
+        </w:rPr>
+      </w:pPr>
       <w:r>
         <w:t>Best regards,</w:t>
       </w:r>
@@ -3447,7 +3457,6 @@
   <w:style w:type="character" w:default="1" w:styleId="DefaultParagraphFont">
     <w:name w:val="Default Paragraph Font"/>
     <w:uiPriority w:val="1"/>
-    <w:semiHidden/>
     <w:unhideWhenUsed/>
   </w:style>
   <w:style w:type="table" w:default="1" w:styleId="TableNormal">

</xml_diff>